<commit_message>
final RL updates without logs
</commit_message>
<xml_diff>
--- a/ai_prompts/rl_integration_prompts/Full RL Agent Implementation.docx
+++ b/ai_prompts/rl_integration_prompts/Full RL Agent Implementation.docx
@@ -1114,7 +1114,14 @@
           <w:b/>
           <w:bCs/>
         </w:rPr>
-        <w:t>600k</w:t>
+        <w:t>8</w:t>
+      </w:r>
+      <w:r>
+        <w:rPr>
+          <w:b/>
+          <w:bCs/>
+        </w:rPr>
+        <w:t>00k</w:t>
       </w:r>
       <w:r>
         <w:t xml:space="preserve"> → strong performance </w:t>

</xml_diff>